<commit_message>
docs & config: update student details and GitHub repository remote
</commit_message>
<xml_diff>
--- a/LAB-ISE2-CICD_pipeline_and_Monitoring_Tools.docx
+++ b/LAB-ISE2-CICD_pipeline_and_Monitoring_Tools.docx
@@ -48,7 +48,7 @@
         <w:tc>
           <w:tcPr>
             <w:tcW w:type="dxa" w:w="3168"/>
-            <w:shd w:val="clear" w:color="auto" w:fill="1F4E79"/>
+            <w:shd w:val="clear" w:color="auto" w:fill="17476E"/>
           </w:tcPr>
           <w:p>
             <w:r>
@@ -63,7 +63,7 @@
         <w:tc>
           <w:tcPr>
             <w:tcW w:type="dxa" w:w="6192"/>
-            <w:shd w:val="clear" w:color="auto" w:fill="1F4E79"/>
+            <w:shd w:val="clear" w:color="auto" w:fill="17476E"/>
           </w:tcPr>
           <w:p>
             <w:r>
@@ -84,7 +84,7 @@
           <w:p>
             <w:r>
               <w:rPr>
-                <w:b/>
+                <w:b w:val="0"/>
                 <w:sz w:val="21"/>
               </w:rPr>
               <w:t>Student Name</w:t>
@@ -98,8 +98,11 @@
           <w:p>
             <w:r>
               <w:rPr>
+                <w:b/>
+                <w:color w:val="002D62"/>
                 <w:sz w:val="21"/>
               </w:rPr>
+              <w:t>Pratham Kadam</w:t>
             </w:r>
           </w:p>
         </w:tc>
@@ -112,7 +115,7 @@
           <w:p>
             <w:r>
               <w:rPr>
-                <w:b/>
+                <w:b w:val="0"/>
                 <w:sz w:val="21"/>
               </w:rPr>
               <w:t>Roll Number(s)</w:t>
@@ -126,8 +129,11 @@
           <w:p>
             <w:r>
               <w:rPr>
+                <w:b/>
+                <w:color w:val="002D62"/>
                 <w:sz w:val="21"/>
               </w:rPr>
+              <w:t>DS 14 (PRN: 2324000362)</w:t>
             </w:r>
           </w:p>
         </w:tc>
@@ -140,7 +146,7 @@
           <w:p>
             <w:r>
               <w:rPr>
-                <w:b/>
+                <w:b w:val="0"/>
                 <w:sz w:val="21"/>
               </w:rPr>
               <w:t>Department / Class</w:t>
@@ -154,9 +160,11 @@
           <w:p>
             <w:r>
               <w:rPr>
+                <w:b/>
+                <w:color w:val="002D62"/>
                 <w:sz w:val="21"/>
               </w:rPr>
-              <w:t>Final Year B. Tech - CSE (Artificial Intelligence and Machine Learning) Sem - VII</w:t>
+              <w:t>Final Year B.Tech CSE (Data Science) - Semester VII</w:t>
             </w:r>
           </w:p>
         </w:tc>
@@ -169,7 +177,7 @@
           <w:p>
             <w:r>
               <w:rPr>
-                <w:b/>
+                <w:b w:val="0"/>
                 <w:sz w:val="21"/>
               </w:rPr>
               <w:t>Academic Year</w:t>
@@ -183,6 +191,8 @@
           <w:p>
             <w:r>
               <w:rPr>
+                <w:b/>
+                <w:color w:val="002D62"/>
                 <w:sz w:val="21"/>
               </w:rPr>
               <w:t>A.Y 2026-27</w:t>
@@ -198,7 +208,7 @@
           <w:p>
             <w:r>
               <w:rPr>
-                <w:b/>
+                <w:b w:val="0"/>
                 <w:sz w:val="21"/>
               </w:rPr>
               <w:t>GitHub Repository URL</w:t>
@@ -212,8 +222,11 @@
           <w:p>
             <w:r>
               <w:rPr>
+                <w:b/>
+                <w:color w:val="002D62"/>
                 <w:sz w:val="21"/>
               </w:rPr>
+              <w:t>https://github.com/prathham-k21/mldevops-cicd.git</w:t>
             </w:r>
           </w:p>
         </w:tc>

</xml_diff>